<commit_message>
feat(so): auto-log generated special orders to document dashboard
Implement `_log_so_as_document` to automatically create a document
record in the main dashboard whenever a Special Order is generated.
This ensures that all generated SO files are tracked within the
centralized document management system, including metadata such as
category, recipient, and an automated travel log entry.
</commit_message>
<xml_diff>
--- a/so_templates/S_O_TEMP.docx
+++ b/so_templates/S_O_TEMP.docx
@@ -51,7 +51,13 @@
         <w:rPr>
           <w:rFonts w:ascii="Bookman Old Style" w:hAnsi="Bookman Old Style"/>
         </w:rPr>
-        <w:t xml:space="preserve"> s. 2025</w:t>
+        <w:t xml:space="preserve"> s. 202</w:t>
+      </w:r>
+      <w:r>
+        <w:rPr>
+          <w:rFonts w:ascii="Bookman Old Style" w:hAnsi="Bookman Old Style"/>
+        </w:rPr>
+        <w:t>6</w:t>
       </w:r>
     </w:p>
     <w:p>
@@ -3293,10 +3299,6 @@
 </file>
 
 <file path=customXml/item1.xml><?xml version="1.0" encoding="utf-8"?>
-<b:Sources xmlns:b="http://schemas.openxmlformats.org/officeDocument/2006/bibliography" xmlns="http://schemas.openxmlformats.org/officeDocument/2006/bibliography" SelectedStyle="\APASixthEditionOfficeOnline.xsl" StyleName="APA" Version="6"/>
-</file>
-
-<file path=customXml/item2.xml><?xml version="1.0" encoding="utf-8"?>
 <s:customData xmlns="http://www.wps.cn/officeDocument/2013/wpsCustomData" xmlns:s="http://www.wps.cn/officeDocument/2013/wpsCustomData">
   <customSectProps/>
   <customShpExts>
@@ -3305,18 +3307,22 @@
 </s:customData>
 </file>
 
+<file path=customXml/item2.xml><?xml version="1.0" encoding="utf-8"?>
+<b:Sources xmlns:b="http://schemas.openxmlformats.org/officeDocument/2006/bibliography" xmlns="http://schemas.openxmlformats.org/officeDocument/2006/bibliography" SelectedStyle="\APASixthEditionOfficeOnline.xsl" StyleName="APA" Version="6"/>
+</file>
+
 <file path=customXml/itemProps1.xml><?xml version="1.0" encoding="utf-8"?>
+<ds:datastoreItem xmlns:ds="http://schemas.openxmlformats.org/officeDocument/2006/customXml" ds:itemID="{B1977F7D-205B-4081-913C-38D41E755F92}">
+  <ds:schemaRefs>
+    <ds:schemaRef ds:uri="http://www.wps.cn/officeDocument/2013/wpsCustomData"/>
+  </ds:schemaRefs>
+</ds:datastoreItem>
+</file>
+
+<file path=customXml/itemProps2.xml><?xml version="1.0" encoding="utf-8"?>
 <ds:datastoreItem xmlns:ds="http://schemas.openxmlformats.org/officeDocument/2006/customXml" ds:itemID="{335C0E28-4147-4C6F-B7FA-AFE4FAB2F5E9}">
   <ds:schemaRefs>
     <ds:schemaRef ds:uri="http://schemas.openxmlformats.org/officeDocument/2006/bibliography"/>
   </ds:schemaRefs>
 </ds:datastoreItem>
-</file>
-
-<file path=customXml/itemProps2.xml><?xml version="1.0" encoding="utf-8"?>
-<ds:datastoreItem xmlns:ds="http://schemas.openxmlformats.org/officeDocument/2006/customXml" ds:itemID="{B1977F7D-205B-4081-913C-38D41E755F92}">
-  <ds:schemaRefs>
-    <ds:schemaRef ds:uri="http://www.wps.cn/officeDocument/2013/wpsCustomData"/>
-  </ds:schemaRefs>
-</ds:datastoreItem>
 </file>
</xml_diff>

<commit_message>
refactor(so): simplify qr code embedding logic
Replace the complex manual XML anchor construction with a more streamlined approach for embedding the QR code into the docx template.

- Update QR code generation parameters for better scannability
- Remove hardcoded absolute positioning XML in favor of template-based insertion
- Add `{{qr_code}}` placeholder to the special orders template
</commit_message>
<xml_diff>
--- a/so_templates/S_O_TEMP.docx
+++ b/so_templates/S_O_TEMP.docx
@@ -37,21 +37,7 @@
         <w:rPr>
           <w:rFonts w:ascii="Bookman Old Style" w:hAnsi="Bookman Old Style"/>
         </w:rPr>
-        <w:t xml:space="preserve">             </w:t>
-      </w:r>
-      <w:proofErr w:type="gramStart"/>
-      <w:r>
-        <w:rPr>
-          <w:rFonts w:ascii="Bookman Old Style" w:hAnsi="Bookman Old Style"/>
-        </w:rPr>
-        <w:t xml:space="preserve">  ,</w:t>
-      </w:r>
-      <w:proofErr w:type="gramEnd"/>
-      <w:r>
-        <w:rPr>
-          <w:rFonts w:ascii="Bookman Old Style" w:hAnsi="Bookman Old Style"/>
-        </w:rPr>
-        <w:t xml:space="preserve"> s. 202</w:t>
+        <w:t xml:space="preserve">               , s. 202</w:t>
       </w:r>
       <w:r>
         <w:rPr>
@@ -121,23 +107,7 @@
           <w:rFonts w:ascii="Bookman Old Style" w:hAnsi="Bookman Old Style"/>
           <w:b/>
         </w:rPr>
-        <w:t>{{</w:t>
-      </w:r>
-      <w:proofErr w:type="spellStart"/>
-      <w:r>
-        <w:rPr>
-          <w:rFonts w:ascii="Bookman Old Style" w:hAnsi="Bookman Old Style"/>
-          <w:b/>
-        </w:rPr>
-        <w:t>employee_full_name</w:t>
-      </w:r>
-      <w:proofErr w:type="spellEnd"/>
-      <w:r>
-        <w:rPr>
-          <w:rFonts w:ascii="Bookman Old Style" w:hAnsi="Bookman Old Style"/>
-          <w:b/>
-        </w:rPr>
-        <w:t>}}</w:t>
+        <w:t>{{employee_full_name}}</w:t>
       </w:r>
     </w:p>
     <w:p>
@@ -152,21 +122,7 @@
         <w:rPr>
           <w:rFonts w:ascii="Bookman Old Style" w:hAnsi="Bookman Old Style"/>
         </w:rPr>
-        <w:t>{{</w:t>
-      </w:r>
-      <w:proofErr w:type="spellStart"/>
-      <w:r>
-        <w:rPr>
-          <w:rFonts w:ascii="Bookman Old Style" w:hAnsi="Bookman Old Style"/>
-        </w:rPr>
-        <w:t>employee_position</w:t>
-      </w:r>
-      <w:proofErr w:type="spellEnd"/>
-      <w:r>
-        <w:rPr>
-          <w:rFonts w:ascii="Bookman Old Style" w:hAnsi="Bookman Old Style"/>
-        </w:rPr>
-        <w:t>}}</w:t>
+        <w:t>{{employee_position}}</w:t>
       </w:r>
     </w:p>
     <w:p>
@@ -343,21 +299,7 @@
         <w:rPr>
           <w:rFonts w:ascii="Bookman Old Style" w:hAnsi="Bookman Old Style"/>
         </w:rPr>
-        <w:t>{{</w:t>
-      </w:r>
-      <w:proofErr w:type="spellStart"/>
-      <w:r>
-        <w:rPr>
-          <w:rFonts w:ascii="Bookman Old Style" w:hAnsi="Bookman Old Style"/>
-        </w:rPr>
-        <w:t>date_issued</w:t>
-      </w:r>
-      <w:proofErr w:type="spellEnd"/>
-      <w:r>
-        <w:rPr>
-          <w:rFonts w:ascii="Bookman Old Style" w:hAnsi="Bookman Old Style"/>
-        </w:rPr>
-        <w:t>}}</w:t>
+        <w:t>{{date_issued}}</w:t>
       </w:r>
     </w:p>
     <w:p>
@@ -585,23 +527,7 @@
           <w:rFonts w:ascii="Bookman Old Style" w:hAnsi="Bookman Old Style"/>
           <w:b/>
         </w:rPr>
-        <w:t>{{</w:t>
-      </w:r>
-      <w:proofErr w:type="spellStart"/>
-      <w:r>
-        <w:rPr>
-          <w:rFonts w:ascii="Bookman Old Style" w:hAnsi="Bookman Old Style"/>
-          <w:b/>
-        </w:rPr>
-        <w:t>employee_full_name</w:t>
-      </w:r>
-      <w:proofErr w:type="spellEnd"/>
-      <w:r>
-        <w:rPr>
-          <w:rFonts w:ascii="Bookman Old Style" w:hAnsi="Bookman Old Style"/>
-          <w:b/>
-        </w:rPr>
-        <w:t>}}</w:t>
+        <w:t>{{employee_full_name}}</w:t>
       </w:r>
     </w:p>
     <w:p>
@@ -883,6 +809,42 @@
           <w:szCs w:val="20"/>
         </w:rPr>
         <w:t>JPSA</w:t>
+      </w:r>
+    </w:p>
+    <w:p>
+      <w:pPr>
+        <w:pStyle w:val="NoSpacing"/>
+        <w:tabs>
+          <w:tab w:val="left" w:pos="0"/>
+        </w:tabs>
+        <w:jc w:val="both"/>
+        <w:rPr>
+          <w:rFonts w:ascii="Bookman Old Style" w:hAnsi="Bookman Old Style"/>
+          <w:sz w:val="20"/>
+          <w:szCs w:val="20"/>
+        </w:rPr>
+      </w:pPr>
+    </w:p>
+    <w:p>
+      <w:pPr>
+        <w:pStyle w:val="NoSpacing"/>
+        <w:tabs>
+          <w:tab w:val="left" w:pos="0"/>
+        </w:tabs>
+        <w:jc w:val="both"/>
+        <w:rPr>
+          <w:rFonts w:ascii="Bookman Old Style" w:hAnsi="Bookman Old Style"/>
+          <w:sz w:val="20"/>
+          <w:szCs w:val="20"/>
+        </w:rPr>
+      </w:pPr>
+      <w:r>
+        <w:rPr>
+          <w:rFonts w:ascii="Bookman Old Style" w:hAnsi="Bookman Old Style"/>
+          <w:sz w:val="20"/>
+          <w:szCs w:val="20"/>
+        </w:rPr>
+        <w:t>{{qr_code}}</w:t>
       </w:r>
     </w:p>
     <w:sectPr>
@@ -2847,7 +2809,6 @@
   <w:style w:type="character" w:default="1" w:styleId="DefaultParagraphFont">
     <w:name w:val="Default Paragraph Font"/>
     <w:uiPriority w:val="1"/>
-    <w:semiHidden/>
     <w:unhideWhenUsed/>
   </w:style>
   <w:style w:type="table" w:default="1" w:styleId="TableNormal">
@@ -3299,6 +3260,10 @@
 </file>
 
 <file path=customXml/item1.xml><?xml version="1.0" encoding="utf-8"?>
+<b:Sources xmlns:b="http://schemas.openxmlformats.org/officeDocument/2006/bibliography" xmlns="http://schemas.openxmlformats.org/officeDocument/2006/bibliography" SelectedStyle="\APASixthEditionOfficeOnline.xsl" StyleName="APA" Version="6"/>
+</file>
+
+<file path=customXml/item2.xml><?xml version="1.0" encoding="utf-8"?>
 <s:customData xmlns="http://www.wps.cn/officeDocument/2013/wpsCustomData" xmlns:s="http://www.wps.cn/officeDocument/2013/wpsCustomData">
   <customSectProps/>
   <customShpExts>
@@ -3307,22 +3272,18 @@
 </s:customData>
 </file>
 
-<file path=customXml/item2.xml><?xml version="1.0" encoding="utf-8"?>
-<b:Sources xmlns:b="http://schemas.openxmlformats.org/officeDocument/2006/bibliography" xmlns="http://schemas.openxmlformats.org/officeDocument/2006/bibliography" SelectedStyle="\APASixthEditionOfficeOnline.xsl" StyleName="APA" Version="6"/>
+<file path=customXml/itemProps1.xml><?xml version="1.0" encoding="utf-8"?>
+<ds:datastoreItem xmlns:ds="http://schemas.openxmlformats.org/officeDocument/2006/customXml" ds:itemID="{335C0E28-4147-4C6F-B7FA-AFE4FAB2F5E9}">
+  <ds:schemaRefs>
+    <ds:schemaRef ds:uri="http://schemas.openxmlformats.org/officeDocument/2006/bibliography"/>
+  </ds:schemaRefs>
+</ds:datastoreItem>
 </file>
 
-<file path=customXml/itemProps1.xml><?xml version="1.0" encoding="utf-8"?>
+<file path=customXml/itemProps2.xml><?xml version="1.0" encoding="utf-8"?>
 <ds:datastoreItem xmlns:ds="http://schemas.openxmlformats.org/officeDocument/2006/customXml" ds:itemID="{B1977F7D-205B-4081-913C-38D41E755F92}">
   <ds:schemaRefs>
     <ds:schemaRef ds:uri="http://www.wps.cn/officeDocument/2013/wpsCustomData"/>
   </ds:schemaRefs>
 </ds:datastoreItem>
-</file>
-
-<file path=customXml/itemProps2.xml><?xml version="1.0" encoding="utf-8"?>
-<ds:datastoreItem xmlns:ds="http://schemas.openxmlformats.org/officeDocument/2006/customXml" ds:itemID="{335C0E28-4147-4C6F-B7FA-AFE4FAB2F5E9}">
-  <ds:schemaRefs>
-    <ds:schemaRef ds:uri="http://schemas.openxmlformats.org/officeDocument/2006/bibliography"/>
-  </ds:schemaRefs>
-</ds:datastoreItem>
 </file>
</xml_diff>

<commit_message>
feat(so): extend QR code embedding to support text boxes
Update the QR code embedding logic to search for the `{{qr_code}}`
placeholder within text boxes in addition to standard body paragraphs.
This ensures that the QR code can be placed in more flexible layouts
within the docx template by traversing the XML structure for
`wps:txbx` elements.
</commit_message>
<xml_diff>
--- a/so_templates/S_O_TEMP.docx
+++ b/so_templates/S_O_TEMP.docx
@@ -37,7 +37,21 @@
         <w:rPr>
           <w:rFonts w:ascii="Bookman Old Style" w:hAnsi="Bookman Old Style"/>
         </w:rPr>
-        <w:t xml:space="preserve">               , s. 202</w:t>
+        <w:t xml:space="preserve">             </w:t>
+      </w:r>
+      <w:proofErr w:type="gramStart"/>
+      <w:r>
+        <w:rPr>
+          <w:rFonts w:ascii="Bookman Old Style" w:hAnsi="Bookman Old Style"/>
+        </w:rPr>
+        <w:t xml:space="preserve">  ,</w:t>
+      </w:r>
+      <w:proofErr w:type="gramEnd"/>
+      <w:r>
+        <w:rPr>
+          <w:rFonts w:ascii="Bookman Old Style" w:hAnsi="Bookman Old Style"/>
+        </w:rPr>
+        <w:t xml:space="preserve"> s. 202</w:t>
       </w:r>
       <w:r>
         <w:rPr>
@@ -107,7 +121,23 @@
           <w:rFonts w:ascii="Bookman Old Style" w:hAnsi="Bookman Old Style"/>
           <w:b/>
         </w:rPr>
-        <w:t>{{employee_full_name}}</w:t>
+        <w:t>{{</w:t>
+      </w:r>
+      <w:proofErr w:type="spellStart"/>
+      <w:r>
+        <w:rPr>
+          <w:rFonts w:ascii="Bookman Old Style" w:hAnsi="Bookman Old Style"/>
+          <w:b/>
+        </w:rPr>
+        <w:t>employee_full_name</w:t>
+      </w:r>
+      <w:proofErr w:type="spellEnd"/>
+      <w:r>
+        <w:rPr>
+          <w:rFonts w:ascii="Bookman Old Style" w:hAnsi="Bookman Old Style"/>
+          <w:b/>
+        </w:rPr>
+        <w:t>}}</w:t>
       </w:r>
     </w:p>
     <w:p>
@@ -122,7 +152,21 @@
         <w:rPr>
           <w:rFonts w:ascii="Bookman Old Style" w:hAnsi="Bookman Old Style"/>
         </w:rPr>
-        <w:t>{{employee_position}}</w:t>
+        <w:t>{{</w:t>
+      </w:r>
+      <w:proofErr w:type="spellStart"/>
+      <w:r>
+        <w:rPr>
+          <w:rFonts w:ascii="Bookman Old Style" w:hAnsi="Bookman Old Style"/>
+        </w:rPr>
+        <w:t>employee_position</w:t>
+      </w:r>
+      <w:proofErr w:type="spellEnd"/>
+      <w:r>
+        <w:rPr>
+          <w:rFonts w:ascii="Bookman Old Style" w:hAnsi="Bookman Old Style"/>
+        </w:rPr>
+        <w:t>}}</w:t>
       </w:r>
     </w:p>
     <w:p>
@@ -299,7 +343,21 @@
         <w:rPr>
           <w:rFonts w:ascii="Bookman Old Style" w:hAnsi="Bookman Old Style"/>
         </w:rPr>
-        <w:t>{{date_issued}}</w:t>
+        <w:t>{{</w:t>
+      </w:r>
+      <w:proofErr w:type="spellStart"/>
+      <w:r>
+        <w:rPr>
+          <w:rFonts w:ascii="Bookman Old Style" w:hAnsi="Bookman Old Style"/>
+        </w:rPr>
+        <w:t>date_issued</w:t>
+      </w:r>
+      <w:proofErr w:type="spellEnd"/>
+      <w:r>
+        <w:rPr>
+          <w:rFonts w:ascii="Bookman Old Style" w:hAnsi="Bookman Old Style"/>
+        </w:rPr>
+        <w:t>}}</w:t>
       </w:r>
     </w:p>
     <w:p>
@@ -527,7 +585,23 @@
           <w:rFonts w:ascii="Bookman Old Style" w:hAnsi="Bookman Old Style"/>
           <w:b/>
         </w:rPr>
-        <w:t>{{employee_full_name}}</w:t>
+        <w:t>{{</w:t>
+      </w:r>
+      <w:proofErr w:type="spellStart"/>
+      <w:r>
+        <w:rPr>
+          <w:rFonts w:ascii="Bookman Old Style" w:hAnsi="Bookman Old Style"/>
+          <w:b/>
+        </w:rPr>
+        <w:t>employee_full_name</w:t>
+      </w:r>
+      <w:proofErr w:type="spellEnd"/>
+      <w:r>
+        <w:rPr>
+          <w:rFonts w:ascii="Bookman Old Style" w:hAnsi="Bookman Old Style"/>
+          <w:b/>
+        </w:rPr>
+        <w:t>}}</w:t>
       </w:r>
     </w:p>
     <w:p>
@@ -628,6 +702,174 @@
           <w:szCs w:val="18"/>
         </w:rPr>
       </w:pPr>
+      <w:r>
+        <w:rPr>
+          <w:rFonts w:ascii="Bookman Old Style" w:hAnsi="Bookman Old Style"/>
+          <w:b/>
+          <w:noProof/>
+        </w:rPr>
+        <mc:AlternateContent>
+          <mc:Choice Requires="wps">
+            <w:drawing>
+              <wp:anchor distT="45720" distB="45720" distL="114300" distR="114300" simplePos="0" relativeHeight="251659264" behindDoc="1" locked="0" layoutInCell="1" allowOverlap="1" wp14:anchorId="5793D4C5" wp14:editId="0F49247E">
+                <wp:simplePos x="0" y="0"/>
+                <wp:positionH relativeFrom="margin">
+                  <wp:posOffset>1152525</wp:posOffset>
+                </wp:positionH>
+                <wp:positionV relativeFrom="paragraph">
+                  <wp:posOffset>6350</wp:posOffset>
+                </wp:positionV>
+                <wp:extent cx="1080000" cy="1080000"/>
+                <wp:effectExtent l="0" t="0" r="25400" b="25400"/>
+                <wp:wrapNone/>
+                <wp:docPr id="217" name="Text Box 2"/>
+                <wp:cNvGraphicFramePr>
+                  <a:graphicFrameLocks xmlns:a="http://schemas.openxmlformats.org/drawingml/2006/main"/>
+                </wp:cNvGraphicFramePr>
+                <a:graphic xmlns:a="http://schemas.openxmlformats.org/drawingml/2006/main">
+                  <a:graphicData uri="http://schemas.microsoft.com/office/word/2010/wordprocessingShape">
+                    <wps:wsp>
+                      <wps:cNvSpPr txBox="1">
+                        <a:spLocks noChangeArrowheads="1"/>
+                      </wps:cNvSpPr>
+                      <wps:spPr bwMode="auto">
+                        <a:xfrm>
+                          <a:off x="0" y="0"/>
+                          <a:ext cx="1080000" cy="1080000"/>
+                        </a:xfrm>
+                        <a:prstGeom prst="rect">
+                          <a:avLst/>
+                        </a:prstGeom>
+                        <a:solidFill>
+                          <a:srgbClr val="FFFFFF"/>
+                        </a:solidFill>
+                        <a:ln w="9525">
+                          <a:solidFill>
+                            <a:srgbClr val="000000"/>
+                          </a:solidFill>
+                          <a:miter lim="800000"/>
+                          <a:headEnd/>
+                          <a:tailEnd/>
+                        </a:ln>
+                      </wps:spPr>
+                      <wps:txbx>
+                        <w:txbxContent>
+                          <w:p>
+                            <w:pPr>
+                              <w:pStyle w:val="NoSpacing"/>
+                              <w:tabs>
+                                <w:tab w:val="left" w:pos="0"/>
+                              </w:tabs>
+                              <w:jc w:val="both"/>
+                              <w:rPr>
+                                <w:rFonts w:ascii="Bookman Old Style" w:hAnsi="Bookman Old Style"/>
+                                <w:sz w:val="20"/>
+                                <w:szCs w:val="20"/>
+                              </w:rPr>
+                            </w:pPr>
+                            <w:r>
+                              <w:rPr>
+                                <w:rFonts w:ascii="Bookman Old Style" w:hAnsi="Bookman Old Style"/>
+                                <w:sz w:val="20"/>
+                                <w:szCs w:val="20"/>
+                              </w:rPr>
+                              <w:t>{{</w:t>
+                            </w:r>
+                            <w:proofErr w:type="spellStart"/>
+                            <w:r>
+                              <w:rPr>
+                                <w:rFonts w:ascii="Bookman Old Style" w:hAnsi="Bookman Old Style"/>
+                                <w:sz w:val="20"/>
+                                <w:szCs w:val="20"/>
+                              </w:rPr>
+                              <w:t>qr_code</w:t>
+                            </w:r>
+                            <w:proofErr w:type="spellEnd"/>
+                            <w:r>
+                              <w:rPr>
+                                <w:rFonts w:ascii="Bookman Old Style" w:hAnsi="Bookman Old Style"/>
+                                <w:sz w:val="20"/>
+                                <w:szCs w:val="20"/>
+                              </w:rPr>
+                              <w:t>}}</w:t>
+                            </w:r>
+                          </w:p>
+                          <w:p/>
+                        </w:txbxContent>
+                      </wps:txbx>
+                      <wps:bodyPr rot="0" vert="horz" wrap="square" lIns="91440" tIns="45720" rIns="91440" bIns="45720" anchor="t" anchorCtr="0">
+                        <a:noAutofit/>
+                      </wps:bodyPr>
+                    </wps:wsp>
+                  </a:graphicData>
+                </a:graphic>
+                <wp14:sizeRelH relativeFrom="margin">
+                  <wp14:pctWidth>0</wp14:pctWidth>
+                </wp14:sizeRelH>
+                <wp14:sizeRelV relativeFrom="margin">
+                  <wp14:pctHeight>0</wp14:pctHeight>
+                </wp14:sizeRelV>
+              </wp:anchor>
+            </w:drawing>
+          </mc:Choice>
+          <mc:Fallback>
+            <w:pict>
+              <v:shapetype w14:anchorId="5793D4C5" id="_x0000_t202" coordsize="21600,21600" o:spt="202" path="m,l,21600r21600,l21600,xe">
+                <v:stroke joinstyle="miter"/>
+                <v:path gradientshapeok="t" o:connecttype="rect"/>
+              </v:shapetype>
+              <v:shape id="Text Box 2" o:spid="_x0000_s1026" type="#_x0000_t202" style="position:absolute;left:0;text-align:left;margin-left:90.75pt;margin-top:.5pt;width:85.05pt;height:85.05pt;z-index:-251657216;visibility:visible;mso-wrap-style:square;mso-width-percent:0;mso-height-percent:0;mso-wrap-distance-left:9pt;mso-wrap-distance-top:3.6pt;mso-wrap-distance-right:9pt;mso-wrap-distance-bottom:3.6pt;mso-position-horizontal:absolute;mso-position-horizontal-relative:margin;mso-position-vertical:absolute;mso-position-vertical-relative:text;mso-width-percent:0;mso-height-percent:0;mso-width-relative:margin;mso-height-relative:margin;v-text-anchor:top" o:gfxdata="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">
+                <v:textbox>
+                  <w:txbxContent>
+                    <w:p>
+                      <w:pPr>
+                        <w:pStyle w:val="NoSpacing"/>
+                        <w:tabs>
+                          <w:tab w:val="left" w:pos="0"/>
+                        </w:tabs>
+                        <w:jc w:val="both"/>
+                        <w:rPr>
+                          <w:rFonts w:ascii="Bookman Old Style" w:hAnsi="Bookman Old Style"/>
+                          <w:sz w:val="20"/>
+                          <w:szCs w:val="20"/>
+                        </w:rPr>
+                      </w:pPr>
+                      <w:r>
+                        <w:rPr>
+                          <w:rFonts w:ascii="Bookman Old Style" w:hAnsi="Bookman Old Style"/>
+                          <w:sz w:val="20"/>
+                          <w:szCs w:val="20"/>
+                        </w:rPr>
+                        <w:t>{{</w:t>
+                      </w:r>
+                      <w:proofErr w:type="spellStart"/>
+                      <w:r>
+                        <w:rPr>
+                          <w:rFonts w:ascii="Bookman Old Style" w:hAnsi="Bookman Old Style"/>
+                          <w:sz w:val="20"/>
+                          <w:szCs w:val="20"/>
+                        </w:rPr>
+                        <w:t>qr_code</w:t>
+                      </w:r>
+                      <w:proofErr w:type="spellEnd"/>
+                      <w:r>
+                        <w:rPr>
+                          <w:rFonts w:ascii="Bookman Old Style" w:hAnsi="Bookman Old Style"/>
+                          <w:sz w:val="20"/>
+                          <w:szCs w:val="20"/>
+                        </w:rPr>
+                        <w:t>}}</w:t>
+                      </w:r>
+                    </w:p>
+                    <w:p/>
+                  </w:txbxContent>
+                </v:textbox>
+                <w10:wrap anchorx="margin"/>
+              </v:shape>
+            </w:pict>
+          </mc:Fallback>
+        </mc:AlternateContent>
+      </w:r>
     </w:p>
     <w:p>
       <w:pPr>
@@ -824,28 +1066,6 @@
           <w:szCs w:val="20"/>
         </w:rPr>
       </w:pPr>
-    </w:p>
-    <w:p>
-      <w:pPr>
-        <w:pStyle w:val="NoSpacing"/>
-        <w:tabs>
-          <w:tab w:val="left" w:pos="0"/>
-        </w:tabs>
-        <w:jc w:val="both"/>
-        <w:rPr>
-          <w:rFonts w:ascii="Bookman Old Style" w:hAnsi="Bookman Old Style"/>
-          <w:sz w:val="20"/>
-          <w:szCs w:val="20"/>
-        </w:rPr>
-      </w:pPr>
-      <w:r>
-        <w:rPr>
-          <w:rFonts w:ascii="Bookman Old Style" w:hAnsi="Bookman Old Style"/>
-          <w:sz w:val="20"/>
-          <w:szCs w:val="20"/>
-        </w:rPr>
-        <w:t>{{qr_code}}</w:t>
-      </w:r>
     </w:p>
     <w:sectPr>
       <w:headerReference w:type="even" r:id="rId9"/>
@@ -1096,7 +1316,7 @@
               <v:stroke joinstyle="miter"/>
               <v:path gradientshapeok="t" o:connecttype="rect"/>
             </v:shapetype>
-            <v:shape id="Text Box 1" o:spid="_x0000_s1026" type="#_x0000_t202" style="position:absolute;margin-left:392.55pt;margin-top:7.8pt;width:64.8pt;height:19.2pt;z-index:251654656;visibility:visible;mso-wrap-style:square;mso-wrap-distance-left:9pt;mso-wrap-distance-top:3.6pt;mso-wrap-distance-right:9pt;mso-wrap-distance-bottom:3.6pt;mso-position-horizontal:absolute;mso-position-horizontal-relative:margin;mso-position-vertical:absolute;mso-position-vertical-relative:text;v-text-anchor:top" o:gfxdata="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" stroked="f">
+            <v:shape id="Text Box 1" o:spid="_x0000_s1027" type="#_x0000_t202" style="position:absolute;margin-left:392.55pt;margin-top:7.8pt;width:64.8pt;height:19.2pt;z-index:251654656;visibility:visible;mso-wrap-style:square;mso-wrap-distance-left:9pt;mso-wrap-distance-top:3.6pt;mso-wrap-distance-right:9pt;mso-wrap-distance-bottom:3.6pt;mso-position-horizontal:absolute;mso-position-horizontal-relative:margin;mso-position-vertical:absolute;mso-position-vertical-relative:text;v-text-anchor:top" o:gfxdata="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" stroked="f">
               <v:textbox>
                 <w:txbxContent>
                   <w:p>
@@ -1625,7 +1845,7 @@
               <v:stroke joinstyle="miter"/>
               <v:path gradientshapeok="t" o:connecttype="rect"/>
             </v:shapetype>
-            <v:shape id="Text Box 3" o:spid="_x0000_s1027" type="#_x0000_t202" style="position:absolute;margin-left:393.6pt;margin-top:1.5pt;width:61.2pt;height:20.5pt;z-index:251655680;visibility:visible;mso-wrap-style:square;mso-wrap-distance-left:9pt;mso-wrap-distance-top:3.6pt;mso-wrap-distance-right:9pt;mso-wrap-distance-bottom:3.6pt;mso-position-horizontal:absolute;mso-position-horizontal-relative:margin;mso-position-vertical:absolute;mso-position-vertical-relative:text;v-text-anchor:top" o:gfxdata="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" filled="f" stroked="f">
+            <v:shape id="Text Box 3" o:spid="_x0000_s1028" type="#_x0000_t202" style="position:absolute;margin-left:393.6pt;margin-top:1.5pt;width:61.2pt;height:20.5pt;z-index:251655680;visibility:visible;mso-wrap-style:square;mso-wrap-distance-left:9pt;mso-wrap-distance-top:3.6pt;mso-wrap-distance-right:9pt;mso-wrap-distance-bottom:3.6pt;mso-position-horizontal:absolute;mso-position-horizontal-relative:margin;mso-position-vertical:absolute;mso-position-vertical-relative:text;v-text-anchor:top" o:gfxdata="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" filled="f" stroked="f">
               <v:textbox>
                 <w:txbxContent>
                   <w:p>
@@ -1858,7 +2078,7 @@
         </mc:Choice>
         <mc:Fallback>
           <w:pict>
-            <v:shape w14:anchorId="3A84B7C2" id="_x0000_s1028" type="#_x0000_t202" style="position:absolute;margin-left:393.6pt;margin-top:1.5pt;width:61.2pt;height:20.5pt;z-index:251656704;visibility:visible;mso-wrap-style:square;mso-wrap-distance-left:9pt;mso-wrap-distance-top:3.6pt;mso-wrap-distance-right:9pt;mso-wrap-distance-bottom:3.6pt;mso-position-horizontal:absolute;mso-position-horizontal-relative:margin;mso-position-vertical:absolute;mso-position-vertical-relative:text;v-text-anchor:top" o:gfxdata="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" filled="f" stroked="f">
+            <v:shape w14:anchorId="3A84B7C2" id="_x0000_s1029" type="#_x0000_t202" style="position:absolute;margin-left:393.6pt;margin-top:1.5pt;width:61.2pt;height:20.5pt;z-index:251656704;visibility:visible;mso-wrap-style:square;mso-wrap-distance-left:9pt;mso-wrap-distance-top:3.6pt;mso-wrap-distance-right:9pt;mso-wrap-distance-bottom:3.6pt;mso-position-horizontal:absolute;mso-position-horizontal-relative:margin;mso-position-vertical:absolute;mso-position-vertical-relative:text;v-text-anchor:top" o:gfxdata="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" filled="f" stroked="f">
               <v:textbox>
                 <w:txbxContent>
                   <w:p>
@@ -2809,6 +3029,7 @@
   <w:style w:type="character" w:default="1" w:styleId="DefaultParagraphFont">
     <w:name w:val="Default Paragraph Font"/>
     <w:uiPriority w:val="1"/>
+    <w:semiHidden/>
     <w:unhideWhenUsed/>
   </w:style>
   <w:style w:type="table" w:default="1" w:styleId="TableNormal">
@@ -3260,10 +3481,6 @@
 </file>
 
 <file path=customXml/item1.xml><?xml version="1.0" encoding="utf-8"?>
-<b:Sources xmlns:b="http://schemas.openxmlformats.org/officeDocument/2006/bibliography" xmlns="http://schemas.openxmlformats.org/officeDocument/2006/bibliography" SelectedStyle="\APASixthEditionOfficeOnline.xsl" StyleName="APA" Version="6"/>
-</file>
-
-<file path=customXml/item2.xml><?xml version="1.0" encoding="utf-8"?>
 <s:customData xmlns="http://www.wps.cn/officeDocument/2013/wpsCustomData" xmlns:s="http://www.wps.cn/officeDocument/2013/wpsCustomData">
   <customSectProps/>
   <customShpExts>
@@ -3272,18 +3489,22 @@
 </s:customData>
 </file>
 
+<file path=customXml/item2.xml><?xml version="1.0" encoding="utf-8"?>
+<b:Sources xmlns:b="http://schemas.openxmlformats.org/officeDocument/2006/bibliography" xmlns="http://schemas.openxmlformats.org/officeDocument/2006/bibliography" SelectedStyle="\APASixthEditionOfficeOnline.xsl" StyleName="APA" Version="6"/>
+</file>
+
 <file path=customXml/itemProps1.xml><?xml version="1.0" encoding="utf-8"?>
+<ds:datastoreItem xmlns:ds="http://schemas.openxmlformats.org/officeDocument/2006/customXml" ds:itemID="{B1977F7D-205B-4081-913C-38D41E755F92}">
+  <ds:schemaRefs>
+    <ds:schemaRef ds:uri="http://www.wps.cn/officeDocument/2013/wpsCustomData"/>
+  </ds:schemaRefs>
+</ds:datastoreItem>
+</file>
+
+<file path=customXml/itemProps2.xml><?xml version="1.0" encoding="utf-8"?>
 <ds:datastoreItem xmlns:ds="http://schemas.openxmlformats.org/officeDocument/2006/customXml" ds:itemID="{335C0E28-4147-4C6F-B7FA-AFE4FAB2F5E9}">
   <ds:schemaRefs>
     <ds:schemaRef ds:uri="http://schemas.openxmlformats.org/officeDocument/2006/bibliography"/>
   </ds:schemaRefs>
 </ds:datastoreItem>
-</file>
-
-<file path=customXml/itemProps2.xml><?xml version="1.0" encoding="utf-8"?>
-<ds:datastoreItem xmlns:ds="http://schemas.openxmlformats.org/officeDocument/2006/customXml" ds:itemID="{B1977F7D-205B-4081-913C-38D41E755F92}">
-  <ds:schemaRefs>
-    <ds:schemaRef ds:uri="http://www.wps.cn/officeDocument/2013/wpsCustomData"/>
-  </ds:schemaRefs>
-</ds:datastoreItem>
 </file>
</xml_diff>

<commit_message>
chore(so): update template assets
</commit_message>
<xml_diff>
--- a/so_templates/S_O_TEMP.docx
+++ b/so_templates/S_O_TEMP.docx
@@ -711,7 +711,7 @@
         <mc:AlternateContent>
           <mc:Choice Requires="wps">
             <w:drawing>
-              <wp:anchor distT="45720" distB="45720" distL="114300" distR="114300" simplePos="0" relativeHeight="251659264" behindDoc="1" locked="0" layoutInCell="1" allowOverlap="1" wp14:anchorId="5793D4C5" wp14:editId="0F49247E">
+              <wp:anchor distT="45720" distB="45720" distL="114300" distR="114300" simplePos="0" relativeHeight="251659264" behindDoc="1" locked="0" layoutInCell="1" allowOverlap="1" wp14:anchorId="5793D4C5" wp14:editId="58CA0C5C">
                 <wp:simplePos x="0" y="0"/>
                 <wp:positionH relativeFrom="margin">
                   <wp:posOffset>1152525</wp:posOffset>
@@ -740,9 +740,7 @@
                         <a:prstGeom prst="rect">
                           <a:avLst/>
                         </a:prstGeom>
-                        <a:solidFill>
-                          <a:srgbClr val="FFFFFF"/>
-                        </a:solidFill>
+                        <a:noFill/>
                         <a:ln w="9525">
                           <a:solidFill>
                             <a:srgbClr val="000000"/>
@@ -818,7 +816,7 @@
                 <v:stroke joinstyle="miter"/>
                 <v:path gradientshapeok="t" o:connecttype="rect"/>
               </v:shapetype>
-              <v:shape id="Text Box 2" o:spid="_x0000_s1026" type="#_x0000_t202" style="position:absolute;left:0;text-align:left;margin-left:90.75pt;margin-top:.5pt;width:85.05pt;height:85.05pt;z-index:-251657216;visibility:visible;mso-wrap-style:square;mso-width-percent:0;mso-height-percent:0;mso-wrap-distance-left:9pt;mso-wrap-distance-top:3.6pt;mso-wrap-distance-right:9pt;mso-wrap-distance-bottom:3.6pt;mso-position-horizontal:absolute;mso-position-horizontal-relative:margin;mso-position-vertical:absolute;mso-position-vertical-relative:text;mso-width-percent:0;mso-height-percent:0;mso-width-relative:margin;mso-height-relative:margin;v-text-anchor:top" o:gfxdata="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">
+              <v:shape id="Text Box 2" o:spid="_x0000_s1026" type="#_x0000_t202" style="position:absolute;left:0;text-align:left;margin-left:90.75pt;margin-top:.5pt;width:85.05pt;height:85.05pt;z-index:-251657216;visibility:visible;mso-wrap-style:square;mso-width-percent:0;mso-height-percent:0;mso-wrap-distance-left:9pt;mso-wrap-distance-top:3.6pt;mso-wrap-distance-right:9pt;mso-wrap-distance-bottom:3.6pt;mso-position-horizontal:absolute;mso-position-horizontal-relative:margin;mso-position-vertical:absolute;mso-position-vertical-relative:text;mso-width-percent:0;mso-height-percent:0;mso-width-relative:margin;mso-height-relative:margin;v-text-anchor:top" o:gfxdata="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" filled="f">
                 <v:textbox>
                   <w:txbxContent>
                     <w:p>

</xml_diff>

<commit_message>
docs(so): update template layout for qr code placement
</commit_message>
<xml_diff>
--- a/so_templates/S_O_TEMP.docx
+++ b/so_templates/S_O_TEMP.docx
@@ -702,6 +702,20 @@
           <w:szCs w:val="18"/>
         </w:rPr>
       </w:pPr>
+    </w:p>
+    <w:p>
+      <w:pPr>
+        <w:pStyle w:val="NoSpacing"/>
+        <w:tabs>
+          <w:tab w:val="left" w:pos="0"/>
+        </w:tabs>
+        <w:jc w:val="both"/>
+        <w:rPr>
+          <w:rFonts w:ascii="Bookman Old Style" w:hAnsi="Bookman Old Style"/>
+          <w:sz w:val="10"/>
+          <w:szCs w:val="10"/>
+        </w:rPr>
+      </w:pPr>
       <w:r>
         <w:rPr>
           <w:rFonts w:ascii="Bookman Old Style" w:hAnsi="Bookman Old Style"/>
@@ -711,16 +725,16 @@
         <mc:AlternateContent>
           <mc:Choice Requires="wps">
             <w:drawing>
-              <wp:anchor distT="45720" distB="45720" distL="114300" distR="114300" simplePos="0" relativeHeight="251659264" behindDoc="1" locked="0" layoutInCell="1" allowOverlap="1" wp14:anchorId="5793D4C5" wp14:editId="58CA0C5C">
+              <wp:anchor distT="45720" distB="45720" distL="114300" distR="114300" simplePos="0" relativeHeight="251659264" behindDoc="1" locked="0" layoutInCell="1" allowOverlap="1" wp14:anchorId="5793D4C5" wp14:editId="6FC575DC">
                 <wp:simplePos x="0" y="0"/>
                 <wp:positionH relativeFrom="margin">
-                  <wp:posOffset>1152525</wp:posOffset>
+                  <wp:posOffset>1104900</wp:posOffset>
                 </wp:positionH>
                 <wp:positionV relativeFrom="paragraph">
-                  <wp:posOffset>6350</wp:posOffset>
+                  <wp:posOffset>5715</wp:posOffset>
                 </wp:positionV>
                 <wp:extent cx="1080000" cy="1080000"/>
-                <wp:effectExtent l="0" t="0" r="25400" b="25400"/>
+                <wp:effectExtent l="0" t="0" r="0" b="6350"/>
                 <wp:wrapNone/>
                 <wp:docPr id="217" name="Text Box 2"/>
                 <wp:cNvGraphicFramePr>
@@ -742,9 +756,7 @@
                         </a:prstGeom>
                         <a:noFill/>
                         <a:ln w="9525">
-                          <a:solidFill>
-                            <a:srgbClr val="000000"/>
-                          </a:solidFill>
+                          <a:noFill/>
                           <a:miter lim="800000"/>
                           <a:headEnd/>
                           <a:tailEnd/>
@@ -816,7 +828,7 @@
                 <v:stroke joinstyle="miter"/>
                 <v:path gradientshapeok="t" o:connecttype="rect"/>
               </v:shapetype>
-              <v:shape id="Text Box 2" o:spid="_x0000_s1026" type="#_x0000_t202" style="position:absolute;left:0;text-align:left;margin-left:90.75pt;margin-top:.5pt;width:85.05pt;height:85.05pt;z-index:-251657216;visibility:visible;mso-wrap-style:square;mso-width-percent:0;mso-height-percent:0;mso-wrap-distance-left:9pt;mso-wrap-distance-top:3.6pt;mso-wrap-distance-right:9pt;mso-wrap-distance-bottom:3.6pt;mso-position-horizontal:absolute;mso-position-horizontal-relative:margin;mso-position-vertical:absolute;mso-position-vertical-relative:text;mso-width-percent:0;mso-height-percent:0;mso-width-relative:margin;mso-height-relative:margin;v-text-anchor:top" o:gfxdata="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" filled="f">
+              <v:shape id="Text Box 2" o:spid="_x0000_s1026" type="#_x0000_t202" style="position:absolute;left:0;text-align:left;margin-left:87pt;margin-top:.45pt;width:85.05pt;height:85.05pt;z-index:-251657216;visibility:visible;mso-wrap-style:square;mso-width-percent:0;mso-height-percent:0;mso-wrap-distance-left:9pt;mso-wrap-distance-top:3.6pt;mso-wrap-distance-right:9pt;mso-wrap-distance-bottom:3.6pt;mso-position-horizontal:absolute;mso-position-horizontal-relative:margin;mso-position-vertical:absolute;mso-position-vertical-relative:text;mso-width-percent:0;mso-height-percent:0;mso-width-relative:margin;mso-height-relative:margin;v-text-anchor:top" o:gfxdata="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" filled="f" stroked="f">
                 <v:textbox>
                   <w:txbxContent>
                     <w:p>
@@ -868,20 +880,6 @@
           </mc:Fallback>
         </mc:AlternateContent>
       </w:r>
-    </w:p>
-    <w:p>
-      <w:pPr>
-        <w:pStyle w:val="NoSpacing"/>
-        <w:tabs>
-          <w:tab w:val="left" w:pos="0"/>
-        </w:tabs>
-        <w:jc w:val="both"/>
-        <w:rPr>
-          <w:rFonts w:ascii="Bookman Old Style" w:hAnsi="Bookman Old Style"/>
-          <w:sz w:val="10"/>
-          <w:szCs w:val="10"/>
-        </w:rPr>
-      </w:pPr>
       <w:r>
         <w:rPr>
           <w:rFonts w:ascii="Bookman Old Style" w:hAnsi="Bookman Old Style"/>

</xml_diff>

<commit_message>
feat(so): add justified text alignment to document body
Update the document generation logic to apply full justification
to paragraphs in the body section. This ensures a professional
layout by setting the `w:jc` property to `both`. Additionally,
cleaned up unnecessary whitespace in the base template.
</commit_message>
<xml_diff>
--- a/so_templates/S_O_TEMP.docx
+++ b/so_templates/S_O_TEMP.docx
@@ -375,15 +375,6 @@
         </w:rPr>
         <w:t>__________________________________________________________________________________</w:t>
       </w:r>
-    </w:p>
-    <w:p>
-      <w:pPr>
-        <w:pStyle w:val="NoSpacing"/>
-        <w:rPr>
-          <w:rFonts w:ascii="Bookman Old Style" w:hAnsi="Bookman Old Style"/>
-          <w:b/>
-        </w:rPr>
-      </w:pPr>
     </w:p>
     <w:p>
       <w:pPr>

</xml_diff>

<commit_message>
style(so): adjust spacing in S_O_TEMP template
Add extra vertical whitespace before the QR code placeholder in the
S_O_TEMP document template to improve layout spacing.
</commit_message>
<xml_diff>
--- a/so_templates/S_O_TEMP.docx
+++ b/so_templates/S_O_TEMP.docx
@@ -677,6 +677,118 @@
         <w:rPr>
           <w:rFonts w:ascii="Bookman Old Style" w:hAnsi="Bookman Old Style"/>
           <w:b/>
+        </w:rPr>
+      </w:pPr>
+    </w:p>
+    <w:p>
+      <w:pPr>
+        <w:pStyle w:val="NoSpacing"/>
+        <w:tabs>
+          <w:tab w:val="left" w:pos="0"/>
+        </w:tabs>
+        <w:jc w:val="both"/>
+        <w:rPr>
+          <w:rFonts w:ascii="Bookman Old Style" w:hAnsi="Bookman Old Style"/>
+          <w:sz w:val="18"/>
+          <w:szCs w:val="18"/>
+        </w:rPr>
+      </w:pPr>
+    </w:p>
+    <w:p>
+      <w:pPr>
+        <w:pStyle w:val="NoSpacing"/>
+        <w:tabs>
+          <w:tab w:val="left" w:pos="0"/>
+        </w:tabs>
+        <w:jc w:val="both"/>
+        <w:rPr>
+          <w:rFonts w:ascii="Bookman Old Style" w:hAnsi="Bookman Old Style"/>
+          <w:sz w:val="18"/>
+          <w:szCs w:val="18"/>
+        </w:rPr>
+      </w:pPr>
+    </w:p>
+    <w:p>
+      <w:pPr>
+        <w:pStyle w:val="NoSpacing"/>
+        <w:tabs>
+          <w:tab w:val="left" w:pos="0"/>
+        </w:tabs>
+        <w:jc w:val="both"/>
+        <w:rPr>
+          <w:rFonts w:ascii="Bookman Old Style" w:hAnsi="Bookman Old Style"/>
+          <w:sz w:val="18"/>
+          <w:szCs w:val="18"/>
+        </w:rPr>
+      </w:pPr>
+    </w:p>
+    <w:p>
+      <w:pPr>
+        <w:pStyle w:val="NoSpacing"/>
+        <w:tabs>
+          <w:tab w:val="left" w:pos="0"/>
+        </w:tabs>
+        <w:jc w:val="both"/>
+        <w:rPr>
+          <w:rFonts w:ascii="Bookman Old Style" w:hAnsi="Bookman Old Style"/>
+          <w:sz w:val="18"/>
+          <w:szCs w:val="18"/>
+        </w:rPr>
+      </w:pPr>
+    </w:p>
+    <w:p>
+      <w:pPr>
+        <w:pStyle w:val="NoSpacing"/>
+        <w:tabs>
+          <w:tab w:val="left" w:pos="0"/>
+        </w:tabs>
+        <w:jc w:val="both"/>
+        <w:rPr>
+          <w:rFonts w:ascii="Bookman Old Style" w:hAnsi="Bookman Old Style"/>
+          <w:sz w:val="18"/>
+          <w:szCs w:val="18"/>
+        </w:rPr>
+      </w:pPr>
+    </w:p>
+    <w:p>
+      <w:pPr>
+        <w:pStyle w:val="NoSpacing"/>
+        <w:tabs>
+          <w:tab w:val="left" w:pos="0"/>
+        </w:tabs>
+        <w:jc w:val="both"/>
+        <w:rPr>
+          <w:rFonts w:ascii="Bookman Old Style" w:hAnsi="Bookman Old Style"/>
+          <w:sz w:val="18"/>
+          <w:szCs w:val="18"/>
+        </w:rPr>
+      </w:pPr>
+    </w:p>
+    <w:p>
+      <w:pPr>
+        <w:pStyle w:val="NoSpacing"/>
+        <w:tabs>
+          <w:tab w:val="left" w:pos="0"/>
+        </w:tabs>
+        <w:jc w:val="both"/>
+        <w:rPr>
+          <w:rFonts w:ascii="Bookman Old Style" w:hAnsi="Bookman Old Style"/>
+          <w:sz w:val="18"/>
+          <w:szCs w:val="18"/>
+        </w:rPr>
+      </w:pPr>
+    </w:p>
+    <w:p>
+      <w:pPr>
+        <w:pStyle w:val="NoSpacing"/>
+        <w:tabs>
+          <w:tab w:val="left" w:pos="0"/>
+        </w:tabs>
+        <w:jc w:val="both"/>
+        <w:rPr>
+          <w:rFonts w:ascii="Bookman Old Style" w:hAnsi="Bookman Old Style"/>
+          <w:sz w:val="18"/>
+          <w:szCs w:val="18"/>
         </w:rPr>
       </w:pPr>
     </w:p>
@@ -3468,6 +3580,10 @@
 </file>
 
 <file path=customXml/item1.xml><?xml version="1.0" encoding="utf-8"?>
+<b:Sources xmlns:b="http://schemas.openxmlformats.org/officeDocument/2006/bibliography" xmlns="http://schemas.openxmlformats.org/officeDocument/2006/bibliography" SelectedStyle="\APASixthEditionOfficeOnline.xsl" StyleName="APA" Version="6"/>
+</file>
+
+<file path=customXml/item2.xml><?xml version="1.0" encoding="utf-8"?>
 <s:customData xmlns="http://www.wps.cn/officeDocument/2013/wpsCustomData" xmlns:s="http://www.wps.cn/officeDocument/2013/wpsCustomData">
   <customSectProps/>
   <customShpExts>
@@ -3476,22 +3592,18 @@
 </s:customData>
 </file>
 
-<file path=customXml/item2.xml><?xml version="1.0" encoding="utf-8"?>
-<b:Sources xmlns:b="http://schemas.openxmlformats.org/officeDocument/2006/bibliography" xmlns="http://schemas.openxmlformats.org/officeDocument/2006/bibliography" SelectedStyle="\APASixthEditionOfficeOnline.xsl" StyleName="APA" Version="6"/>
+<file path=customXml/itemProps1.xml><?xml version="1.0" encoding="utf-8"?>
+<ds:datastoreItem xmlns:ds="http://schemas.openxmlformats.org/officeDocument/2006/customXml" ds:itemID="{335C0E28-4147-4C6F-B7FA-AFE4FAB2F5E9}">
+  <ds:schemaRefs>
+    <ds:schemaRef ds:uri="http://schemas.openxmlformats.org/officeDocument/2006/bibliography"/>
+  </ds:schemaRefs>
+</ds:datastoreItem>
 </file>
 
-<file path=customXml/itemProps1.xml><?xml version="1.0" encoding="utf-8"?>
+<file path=customXml/itemProps2.xml><?xml version="1.0" encoding="utf-8"?>
 <ds:datastoreItem xmlns:ds="http://schemas.openxmlformats.org/officeDocument/2006/customXml" ds:itemID="{B1977F7D-205B-4081-913C-38D41E755F92}">
   <ds:schemaRefs>
     <ds:schemaRef ds:uri="http://www.wps.cn/officeDocument/2013/wpsCustomData"/>
   </ds:schemaRefs>
 </ds:datastoreItem>
-</file>
-
-<file path=customXml/itemProps2.xml><?xml version="1.0" encoding="utf-8"?>
-<ds:datastoreItem xmlns:ds="http://schemas.openxmlformats.org/officeDocument/2006/customXml" ds:itemID="{335C0E28-4147-4C6F-B7FA-AFE4FAB2F5E9}">
-  <ds:schemaRefs>
-    <ds:schemaRef ds:uri="http://schemas.openxmlformats.org/officeDocument/2006/bibliography"/>
-  </ds:schemaRefs>
-</ds:datastoreItem>
 </file>
</xml_diff>

<commit_message>
feat(so): implement dynamic reference codes and markdown-style bolding
Introduce a dynamic reference code generation system based on user initials
and update the document generation logic to support markdown-style bold
syntax (e.g., `**text**`) within template strings.

- Add `_get_initials` helper to derive initials from session name
- Implement `{{reference_code}}` placeholder in S_O_TEMP template
- Update `_replace_body` to detect and apply bold formatting to text
  wrapped in double asterisks
- Add honorific selection to the SO request form UI
- Update SO template content to include bolding for accountability text
</commit_message>
<xml_diff>
--- a/so_templates/S_O_TEMP.docx
+++ b/so_templates/S_O_TEMP.docx
@@ -37,21 +37,7 @@
         <w:rPr>
           <w:rFonts w:ascii="Bookman Old Style" w:hAnsi="Bookman Old Style"/>
         </w:rPr>
-        <w:t xml:space="preserve">             </w:t>
-      </w:r>
-      <w:proofErr w:type="gramStart"/>
-      <w:r>
-        <w:rPr>
-          <w:rFonts w:ascii="Bookman Old Style" w:hAnsi="Bookman Old Style"/>
-        </w:rPr>
-        <w:t xml:space="preserve">  ,</w:t>
-      </w:r>
-      <w:proofErr w:type="gramEnd"/>
-      <w:r>
-        <w:rPr>
-          <w:rFonts w:ascii="Bookman Old Style" w:hAnsi="Bookman Old Style"/>
-        </w:rPr>
-        <w:t xml:space="preserve"> s. 202</w:t>
+        <w:t xml:space="preserve">               , s. 202</w:t>
       </w:r>
       <w:r>
         <w:rPr>
@@ -569,7 +555,7 @@
           <w:rFonts w:ascii="Bookman Old Style" w:hAnsi="Bookman Old Style"/>
           <w:b/>
         </w:rPr>
-        <w:t xml:space="preserve">       </w:t>
+        <w:t xml:space="preserve">      </w:t>
       </w:r>
       <w:r>
         <w:rPr>
@@ -1141,30 +1127,26 @@
           <w:sz w:val="20"/>
           <w:szCs w:val="20"/>
         </w:rPr>
-        <w:t>OSDS-PU-</w:t>
-      </w:r>
+        <w:t>{{</w:t>
+      </w:r>
+      <w:proofErr w:type="spellStart"/>
       <w:r>
         <w:rPr>
           <w:rFonts w:ascii="Bookman Old Style" w:hAnsi="Bookman Old Style"/>
           <w:sz w:val="20"/>
           <w:szCs w:val="20"/>
         </w:rPr>
-        <w:t>JPSA</w:t>
-      </w:r>
-    </w:p>
-    <w:p>
-      <w:pPr>
-        <w:pStyle w:val="NoSpacing"/>
-        <w:tabs>
-          <w:tab w:val="left" w:pos="0"/>
-        </w:tabs>
-        <w:jc w:val="both"/>
+        <w:t>reference_code</w:t>
+      </w:r>
+      <w:proofErr w:type="spellEnd"/>
+      <w:r>
         <w:rPr>
           <w:rFonts w:ascii="Bookman Old Style" w:hAnsi="Bookman Old Style"/>
           <w:sz w:val="20"/>
           <w:szCs w:val="20"/>
         </w:rPr>
-      </w:pPr>
+        <w:t>}}</w:t>
+      </w:r>
     </w:p>
     <w:sectPr>
       <w:headerReference w:type="even" r:id="rId9"/>
@@ -3128,7 +3110,6 @@
   <w:style w:type="character" w:default="1" w:styleId="DefaultParagraphFont">
     <w:name w:val="Default Paragraph Font"/>
     <w:uiPriority w:val="1"/>
-    <w:semiHidden/>
     <w:unhideWhenUsed/>
   </w:style>
   <w:style w:type="table" w:default="1" w:styleId="TableNormal">

</xml_diff>

<commit_message>
chore(so): cleanup template files and remove temporary document
Remove unnecessary whitespace and empty lines from the S_O_TEMP.docx
template and delete the temporary owner file (~$O_TEMP.docx).
</commit_message>
<xml_diff>
--- a/so_templates/S_O_TEMP.docx
+++ b/so_templates/S_O_TEMP.docx
@@ -37,7 +37,21 @@
         <w:rPr>
           <w:rFonts w:ascii="Bookman Old Style" w:hAnsi="Bookman Old Style"/>
         </w:rPr>
-        <w:t xml:space="preserve">               , s. 202</w:t>
+        <w:t xml:space="preserve">             </w:t>
+      </w:r>
+      <w:proofErr w:type="gramStart"/>
+      <w:r>
+        <w:rPr>
+          <w:rFonts w:ascii="Bookman Old Style" w:hAnsi="Bookman Old Style"/>
+        </w:rPr>
+        <w:t xml:space="preserve">  ,</w:t>
+      </w:r>
+      <w:proofErr w:type="gramEnd"/>
+      <w:r>
+        <w:rPr>
+          <w:rFonts w:ascii="Bookman Old Style" w:hAnsi="Bookman Old Style"/>
+        </w:rPr>
+        <w:t xml:space="preserve"> s. 202</w:t>
       </w:r>
       <w:r>
         <w:rPr>
@@ -583,78 +597,6 @@
     </w:p>
     <w:p>
       <w:pPr>
-        <w:spacing w:after="0"/>
-        <w:rPr>
-          <w:rFonts w:ascii="Bookman Old Style" w:hAnsi="Bookman Old Style"/>
-          <w:lang w:val="en"/>
-        </w:rPr>
-      </w:pPr>
-    </w:p>
-    <w:p>
-      <w:pPr>
-        <w:spacing w:after="0"/>
-        <w:rPr>
-          <w:rFonts w:ascii="Bookman Old Style" w:hAnsi="Bookman Old Style"/>
-          <w:b/>
-        </w:rPr>
-      </w:pPr>
-    </w:p>
-    <w:p>
-      <w:pPr>
-        <w:spacing w:after="0"/>
-        <w:rPr>
-          <w:rFonts w:ascii="Bookman Old Style" w:hAnsi="Bookman Old Style"/>
-          <w:b/>
-        </w:rPr>
-      </w:pPr>
-    </w:p>
-    <w:p>
-      <w:pPr>
-        <w:spacing w:after="0"/>
-        <w:rPr>
-          <w:rFonts w:ascii="Bookman Old Style" w:hAnsi="Bookman Old Style"/>
-          <w:b/>
-        </w:rPr>
-      </w:pPr>
-    </w:p>
-    <w:p>
-      <w:pPr>
-        <w:spacing w:after="0"/>
-        <w:rPr>
-          <w:rFonts w:ascii="Bookman Old Style" w:hAnsi="Bookman Old Style"/>
-          <w:b/>
-        </w:rPr>
-      </w:pPr>
-    </w:p>
-    <w:p>
-      <w:pPr>
-        <w:spacing w:after="0"/>
-        <w:rPr>
-          <w:rFonts w:ascii="Bookman Old Style" w:hAnsi="Bookman Old Style"/>
-          <w:b/>
-        </w:rPr>
-      </w:pPr>
-    </w:p>
-    <w:p>
-      <w:pPr>
-        <w:spacing w:after="0"/>
-        <w:rPr>
-          <w:rFonts w:ascii="Bookman Old Style" w:hAnsi="Bookman Old Style"/>
-          <w:b/>
-        </w:rPr>
-      </w:pPr>
-    </w:p>
-    <w:p>
-      <w:pPr>
-        <w:spacing w:after="0"/>
-        <w:rPr>
-          <w:rFonts w:ascii="Bookman Old Style" w:hAnsi="Bookman Old Style"/>
-          <w:b/>
-        </w:rPr>
-      </w:pPr>
-    </w:p>
-    <w:p>
-      <w:pPr>
         <w:pStyle w:val="NoSpacing"/>
         <w:tabs>
           <w:tab w:val="left" w:pos="0"/>
@@ -662,7 +604,8 @@
         <w:jc w:val="both"/>
         <w:rPr>
           <w:rFonts w:ascii="Bookman Old Style" w:hAnsi="Bookman Old Style"/>
-          <w:b/>
+          <w:sz w:val="18"/>
+          <w:szCs w:val="18"/>
         </w:rPr>
       </w:pPr>
     </w:p>
@@ -703,104 +646,6 @@
         <w:jc w:val="both"/>
         <w:rPr>
           <w:rFonts w:ascii="Bookman Old Style" w:hAnsi="Bookman Old Style"/>
-          <w:sz w:val="18"/>
-          <w:szCs w:val="18"/>
-        </w:rPr>
-      </w:pPr>
-    </w:p>
-    <w:p>
-      <w:pPr>
-        <w:pStyle w:val="NoSpacing"/>
-        <w:tabs>
-          <w:tab w:val="left" w:pos="0"/>
-        </w:tabs>
-        <w:jc w:val="both"/>
-        <w:rPr>
-          <w:rFonts w:ascii="Bookman Old Style" w:hAnsi="Bookman Old Style"/>
-          <w:sz w:val="18"/>
-          <w:szCs w:val="18"/>
-        </w:rPr>
-      </w:pPr>
-    </w:p>
-    <w:p>
-      <w:pPr>
-        <w:pStyle w:val="NoSpacing"/>
-        <w:tabs>
-          <w:tab w:val="left" w:pos="0"/>
-        </w:tabs>
-        <w:jc w:val="both"/>
-        <w:rPr>
-          <w:rFonts w:ascii="Bookman Old Style" w:hAnsi="Bookman Old Style"/>
-          <w:sz w:val="18"/>
-          <w:szCs w:val="18"/>
-        </w:rPr>
-      </w:pPr>
-    </w:p>
-    <w:p>
-      <w:pPr>
-        <w:pStyle w:val="NoSpacing"/>
-        <w:tabs>
-          <w:tab w:val="left" w:pos="0"/>
-        </w:tabs>
-        <w:jc w:val="both"/>
-        <w:rPr>
-          <w:rFonts w:ascii="Bookman Old Style" w:hAnsi="Bookman Old Style"/>
-          <w:sz w:val="18"/>
-          <w:szCs w:val="18"/>
-        </w:rPr>
-      </w:pPr>
-    </w:p>
-    <w:p>
-      <w:pPr>
-        <w:pStyle w:val="NoSpacing"/>
-        <w:tabs>
-          <w:tab w:val="left" w:pos="0"/>
-        </w:tabs>
-        <w:jc w:val="both"/>
-        <w:rPr>
-          <w:rFonts w:ascii="Bookman Old Style" w:hAnsi="Bookman Old Style"/>
-          <w:sz w:val="18"/>
-          <w:szCs w:val="18"/>
-        </w:rPr>
-      </w:pPr>
-    </w:p>
-    <w:p>
-      <w:pPr>
-        <w:pStyle w:val="NoSpacing"/>
-        <w:tabs>
-          <w:tab w:val="left" w:pos="0"/>
-        </w:tabs>
-        <w:jc w:val="both"/>
-        <w:rPr>
-          <w:rFonts w:ascii="Bookman Old Style" w:hAnsi="Bookman Old Style"/>
-          <w:sz w:val="18"/>
-          <w:szCs w:val="18"/>
-        </w:rPr>
-      </w:pPr>
-    </w:p>
-    <w:p>
-      <w:pPr>
-        <w:pStyle w:val="NoSpacing"/>
-        <w:tabs>
-          <w:tab w:val="left" w:pos="0"/>
-        </w:tabs>
-        <w:jc w:val="both"/>
-        <w:rPr>
-          <w:rFonts w:ascii="Bookman Old Style" w:hAnsi="Bookman Old Style"/>
-          <w:sz w:val="18"/>
-          <w:szCs w:val="18"/>
-        </w:rPr>
-      </w:pPr>
-    </w:p>
-    <w:p>
-      <w:pPr>
-        <w:pStyle w:val="NoSpacing"/>
-        <w:tabs>
-          <w:tab w:val="left" w:pos="0"/>
-        </w:tabs>
-        <w:jc w:val="both"/>
-        <w:rPr>
-          <w:rFonts w:ascii="Bookman Old Style" w:hAnsi="Bookman Old Style"/>
           <w:sz w:val="10"/>
           <w:szCs w:val="10"/>
         </w:rPr>
@@ -814,13 +659,13 @@
         <mc:AlternateContent>
           <mc:Choice Requires="wps">
             <w:drawing>
-              <wp:anchor distT="45720" distB="45720" distL="114300" distR="114300" simplePos="0" relativeHeight="251659264" behindDoc="1" locked="0" layoutInCell="1" allowOverlap="1" wp14:anchorId="5793D4C5" wp14:editId="6FC575DC">
+              <wp:anchor distT="45720" distB="45720" distL="114300" distR="114300" simplePos="0" relativeHeight="251659264" behindDoc="1" locked="1" layoutInCell="1" allowOverlap="1" wp14:anchorId="5793D4C5" wp14:editId="5CCA4A60">
                 <wp:simplePos x="0" y="0"/>
                 <wp:positionH relativeFrom="margin">
-                  <wp:posOffset>1104900</wp:posOffset>
+                  <wp:posOffset>1105535</wp:posOffset>
                 </wp:positionH>
                 <wp:positionV relativeFrom="paragraph">
-                  <wp:posOffset>5715</wp:posOffset>
+                  <wp:posOffset>6985</wp:posOffset>
                 </wp:positionV>
                 <wp:extent cx="1080000" cy="1080000"/>
                 <wp:effectExtent l="0" t="0" r="0" b="6350"/>
@@ -917,7 +762,7 @@
                 <v:stroke joinstyle="miter"/>
                 <v:path gradientshapeok="t" o:connecttype="rect"/>
               </v:shapetype>
-              <v:shape id="Text Box 2" o:spid="_x0000_s1026" type="#_x0000_t202" style="position:absolute;left:0;text-align:left;margin-left:87pt;margin-top:.45pt;width:85.05pt;height:85.05pt;z-index:-251657216;visibility:visible;mso-wrap-style:square;mso-width-percent:0;mso-height-percent:0;mso-wrap-distance-left:9pt;mso-wrap-distance-top:3.6pt;mso-wrap-distance-right:9pt;mso-wrap-distance-bottom:3.6pt;mso-position-horizontal:absolute;mso-position-horizontal-relative:margin;mso-position-vertical:absolute;mso-position-vertical-relative:text;mso-width-percent:0;mso-height-percent:0;mso-width-relative:margin;mso-height-relative:margin;v-text-anchor:top" o:gfxdata="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" filled="f" stroked="f">
+              <v:shape id="Text Box 2" o:spid="_x0000_s1026" type="#_x0000_t202" style="position:absolute;left:0;text-align:left;margin-left:87.05pt;margin-top:.55pt;width:85.05pt;height:85.05pt;z-index:-251657216;visibility:visible;mso-wrap-style:square;mso-width-percent:0;mso-height-percent:0;mso-wrap-distance-left:9pt;mso-wrap-distance-top:3.6pt;mso-wrap-distance-right:9pt;mso-wrap-distance-bottom:3.6pt;mso-position-horizontal:absolute;mso-position-horizontal-relative:margin;mso-position-vertical:absolute;mso-position-vertical-relative:text;mso-width-percent:0;mso-height-percent:0;mso-width-relative:margin;mso-height-relative:margin;v-text-anchor:top" o:gfxdata="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" filled="f" stroked="f">
                 <v:textbox>
                   <w:txbxContent>
                     <w:p>
@@ -964,6 +809,7 @@
                   </w:txbxContent>
                 </v:textbox>
                 <w10:wrap anchorx="margin"/>
+                <w10:anchorlock/>
               </v:shape>
             </w:pict>
           </mc:Fallback>

</xml_diff>

<commit_message>
refactor(so): adjust spacing in S_O_TEMP template
Add extra line breaks before the qr_code placeholder in the S_O_TEMP document to improve visual separation.
</commit_message>
<xml_diff>
--- a/so_templates/S_O_TEMP.docx
+++ b/so_templates/S_O_TEMP.docx
@@ -594,6 +594,48 @@
         </w:rPr>
         <w:t>}}</w:t>
       </w:r>
+    </w:p>
+    <w:p>
+      <w:pPr>
+        <w:pStyle w:val="NoSpacing"/>
+        <w:tabs>
+          <w:tab w:val="left" w:pos="0"/>
+        </w:tabs>
+        <w:jc w:val="both"/>
+        <w:rPr>
+          <w:rFonts w:ascii="Bookman Old Style" w:hAnsi="Bookman Old Style"/>
+          <w:sz w:val="18"/>
+          <w:szCs w:val="18"/>
+        </w:rPr>
+      </w:pPr>
+    </w:p>
+    <w:p>
+      <w:pPr>
+        <w:pStyle w:val="NoSpacing"/>
+        <w:tabs>
+          <w:tab w:val="left" w:pos="0"/>
+        </w:tabs>
+        <w:jc w:val="both"/>
+        <w:rPr>
+          <w:rFonts w:ascii="Bookman Old Style" w:hAnsi="Bookman Old Style"/>
+          <w:sz w:val="18"/>
+          <w:szCs w:val="18"/>
+        </w:rPr>
+      </w:pPr>
+    </w:p>
+    <w:p>
+      <w:pPr>
+        <w:pStyle w:val="NoSpacing"/>
+        <w:tabs>
+          <w:tab w:val="left" w:pos="0"/>
+        </w:tabs>
+        <w:jc w:val="both"/>
+        <w:rPr>
+          <w:rFonts w:ascii="Bookman Old Style" w:hAnsi="Bookman Old Style"/>
+          <w:sz w:val="18"/>
+          <w:szCs w:val="18"/>
+        </w:rPr>
+      </w:pPr>
     </w:p>
     <w:p>
       <w:pPr>
@@ -2956,6 +2998,7 @@
   <w:style w:type="character" w:default="1" w:styleId="DefaultParagraphFont">
     <w:name w:val="Default Paragraph Font"/>
     <w:uiPriority w:val="1"/>
+    <w:semiHidden/>
     <w:unhideWhenUsed/>
   </w:style>
   <w:style w:type="table" w:default="1" w:styleId="TableNormal">
@@ -3407,10 +3450,6 @@
 </file>
 
 <file path=customXml/item1.xml><?xml version="1.0" encoding="utf-8"?>
-<b:Sources xmlns:b="http://schemas.openxmlformats.org/officeDocument/2006/bibliography" xmlns="http://schemas.openxmlformats.org/officeDocument/2006/bibliography" SelectedStyle="\APASixthEditionOfficeOnline.xsl" StyleName="APA" Version="6"/>
-</file>
-
-<file path=customXml/item2.xml><?xml version="1.0" encoding="utf-8"?>
 <s:customData xmlns="http://www.wps.cn/officeDocument/2013/wpsCustomData" xmlns:s="http://www.wps.cn/officeDocument/2013/wpsCustomData">
   <customSectProps/>
   <customShpExts>
@@ -3419,18 +3458,22 @@
 </s:customData>
 </file>
 
+<file path=customXml/item2.xml><?xml version="1.0" encoding="utf-8"?>
+<b:Sources xmlns:b="http://schemas.openxmlformats.org/officeDocument/2006/bibliography" xmlns="http://schemas.openxmlformats.org/officeDocument/2006/bibliography" SelectedStyle="\APASixthEditionOfficeOnline.xsl" StyleName="APA" Version="6"/>
+</file>
+
 <file path=customXml/itemProps1.xml><?xml version="1.0" encoding="utf-8"?>
+<ds:datastoreItem xmlns:ds="http://schemas.openxmlformats.org/officeDocument/2006/customXml" ds:itemID="{B1977F7D-205B-4081-913C-38D41E755F92}">
+  <ds:schemaRefs>
+    <ds:schemaRef ds:uri="http://www.wps.cn/officeDocument/2013/wpsCustomData"/>
+  </ds:schemaRefs>
+</ds:datastoreItem>
+</file>
+
+<file path=customXml/itemProps2.xml><?xml version="1.0" encoding="utf-8"?>
 <ds:datastoreItem xmlns:ds="http://schemas.openxmlformats.org/officeDocument/2006/customXml" ds:itemID="{335C0E28-4147-4C6F-B7FA-AFE4FAB2F5E9}">
   <ds:schemaRefs>
     <ds:schemaRef ds:uri="http://schemas.openxmlformats.org/officeDocument/2006/bibliography"/>
   </ds:schemaRefs>
 </ds:datastoreItem>
-</file>
-
-<file path=customXml/itemProps2.xml><?xml version="1.0" encoding="utf-8"?>
-<ds:datastoreItem xmlns:ds="http://schemas.openxmlformats.org/officeDocument/2006/customXml" ds:itemID="{B1977F7D-205B-4081-913C-38D41E755F92}">
-  <ds:schemaRefs>
-    <ds:schemaRef ds:uri="http://www.wps.cn/officeDocument/2013/wpsCustomData"/>
-  </ds:schemaRefs>
-</ds:datastoreItem>
 </file>
</xml_diff>

<commit_message>
style(so): update whitespace in S_O_TEMP template
Add a newline before the qr_code placeholder to adjust document layout.
</commit_message>
<xml_diff>
--- a/so_templates/S_O_TEMP.docx
+++ b/so_templates/S_O_TEMP.docx
@@ -594,6 +594,20 @@
         </w:rPr>
         <w:t>}}</w:t>
       </w:r>
+    </w:p>
+    <w:p>
+      <w:pPr>
+        <w:pStyle w:val="NoSpacing"/>
+        <w:tabs>
+          <w:tab w:val="left" w:pos="0"/>
+        </w:tabs>
+        <w:jc w:val="both"/>
+        <w:rPr>
+          <w:rFonts w:ascii="Bookman Old Style" w:hAnsi="Bookman Old Style"/>
+          <w:sz w:val="18"/>
+          <w:szCs w:val="18"/>
+        </w:rPr>
+      </w:pPr>
     </w:p>
     <w:p>
       <w:pPr>

</xml_diff>

<commit_message>
feat(so): add approval basis field and name title casing logic
Introduce the `approval_basis` field to the designation renewal SO type,
including a dynamic select input in the frontend. Additionally, implement
a name title-casing utility to ensure consistent formatting of employee
names in the generated document body.
</commit_message>
<xml_diff>
--- a/so_templates/S_O_TEMP.docx
+++ b/so_templates/S_O_TEMP.docx
@@ -715,15 +715,15 @@
         <mc:AlternateContent>
           <mc:Choice Requires="wps">
             <w:drawing>
-              <wp:anchor distT="45720" distB="45720" distL="114300" distR="114300" simplePos="0" relativeHeight="251659264" behindDoc="1" locked="1" layoutInCell="1" allowOverlap="1" wp14:anchorId="5793D4C5" wp14:editId="5CCA4A60">
+              <wp:anchor distT="45720" distB="45720" distL="114300" distR="114300" simplePos="0" relativeHeight="251659264" behindDoc="1" locked="1" layoutInCell="1" allowOverlap="1" wp14:anchorId="5793D4C5" wp14:editId="2A2E5F40">
                 <wp:simplePos x="0" y="0"/>
                 <wp:positionH relativeFrom="margin">
-                  <wp:posOffset>1105535</wp:posOffset>
+                  <wp:posOffset>810260</wp:posOffset>
                 </wp:positionH>
                 <wp:positionV relativeFrom="paragraph">
                   <wp:posOffset>6985</wp:posOffset>
                 </wp:positionV>
-                <wp:extent cx="1080000" cy="1080000"/>
+                <wp:extent cx="1079500" cy="1079500"/>
                 <wp:effectExtent l="0" t="0" r="0" b="6350"/>
                 <wp:wrapNone/>
                 <wp:docPr id="217" name="Text Box 2"/>
@@ -739,7 +739,7 @@
                       <wps:spPr bwMode="auto">
                         <a:xfrm>
                           <a:off x="0" y="0"/>
-                          <a:ext cx="1080000" cy="1080000"/>
+                          <a:ext cx="1079500" cy="1079500"/>
                         </a:xfrm>
                         <a:prstGeom prst="rect">
                           <a:avLst/>
@@ -818,7 +818,7 @@
                 <v:stroke joinstyle="miter"/>
                 <v:path gradientshapeok="t" o:connecttype="rect"/>
               </v:shapetype>
-              <v:shape id="Text Box 2" o:spid="_x0000_s1026" type="#_x0000_t202" style="position:absolute;left:0;text-align:left;margin-left:87.05pt;margin-top:.55pt;width:85.05pt;height:85.05pt;z-index:-251657216;visibility:visible;mso-wrap-style:square;mso-width-percent:0;mso-height-percent:0;mso-wrap-distance-left:9pt;mso-wrap-distance-top:3.6pt;mso-wrap-distance-right:9pt;mso-wrap-distance-bottom:3.6pt;mso-position-horizontal:absolute;mso-position-horizontal-relative:margin;mso-position-vertical:absolute;mso-position-vertical-relative:text;mso-width-percent:0;mso-height-percent:0;mso-width-relative:margin;mso-height-relative:margin;v-text-anchor:top" o:gfxdata="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" filled="f" stroked="f">
+              <v:shape id="Text Box 2" o:spid="_x0000_s1026" type="#_x0000_t202" style="position:absolute;left:0;text-align:left;margin-left:63.8pt;margin-top:.55pt;width:85pt;height:85pt;z-index:-251657216;visibility:visible;mso-wrap-style:square;mso-width-percent:0;mso-height-percent:0;mso-wrap-distance-left:9pt;mso-wrap-distance-top:3.6pt;mso-wrap-distance-right:9pt;mso-wrap-distance-bottom:3.6pt;mso-position-horizontal:absolute;mso-position-horizontal-relative:margin;mso-position-vertical:absolute;mso-position-vertical-relative:text;mso-width-percent:0;mso-height-percent:0;mso-width-relative:margin;mso-height-relative:margin;v-text-anchor:top" o:gfxdata="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" filled="f" stroked="f">
                 <v:textbox>
                   <w:txbxContent>
                     <w:p>
@@ -3464,6 +3464,10 @@
 </file>
 
 <file path=customXml/item1.xml><?xml version="1.0" encoding="utf-8"?>
+<b:Sources xmlns:b="http://schemas.openxmlformats.org/officeDocument/2006/bibliography" xmlns="http://schemas.openxmlformats.org/officeDocument/2006/bibliography" SelectedStyle="\APASixthEditionOfficeOnline.xsl" StyleName="APA" Version="6"/>
+</file>
+
+<file path=customXml/item2.xml><?xml version="1.0" encoding="utf-8"?>
 <s:customData xmlns="http://www.wps.cn/officeDocument/2013/wpsCustomData" xmlns:s="http://www.wps.cn/officeDocument/2013/wpsCustomData">
   <customSectProps/>
   <customShpExts>
@@ -3472,22 +3476,18 @@
 </s:customData>
 </file>
 
-<file path=customXml/item2.xml><?xml version="1.0" encoding="utf-8"?>
-<b:Sources xmlns:b="http://schemas.openxmlformats.org/officeDocument/2006/bibliography" xmlns="http://schemas.openxmlformats.org/officeDocument/2006/bibliography" SelectedStyle="\APASixthEditionOfficeOnline.xsl" StyleName="APA" Version="6"/>
+<file path=customXml/itemProps1.xml><?xml version="1.0" encoding="utf-8"?>
+<ds:datastoreItem xmlns:ds="http://schemas.openxmlformats.org/officeDocument/2006/customXml" ds:itemID="{335C0E28-4147-4C6F-B7FA-AFE4FAB2F5E9}">
+  <ds:schemaRefs>
+    <ds:schemaRef ds:uri="http://schemas.openxmlformats.org/officeDocument/2006/bibliography"/>
+  </ds:schemaRefs>
+</ds:datastoreItem>
 </file>
 
-<file path=customXml/itemProps1.xml><?xml version="1.0" encoding="utf-8"?>
+<file path=customXml/itemProps2.xml><?xml version="1.0" encoding="utf-8"?>
 <ds:datastoreItem xmlns:ds="http://schemas.openxmlformats.org/officeDocument/2006/customXml" ds:itemID="{B1977F7D-205B-4081-913C-38D41E755F92}">
   <ds:schemaRefs>
     <ds:schemaRef ds:uri="http://www.wps.cn/officeDocument/2013/wpsCustomData"/>
   </ds:schemaRefs>
 </ds:datastoreItem>
-</file>
-
-<file path=customXml/itemProps2.xml><?xml version="1.0" encoding="utf-8"?>
-<ds:datastoreItem xmlns:ds="http://schemas.openxmlformats.org/officeDocument/2006/customXml" ds:itemID="{335C0E28-4147-4C6F-B7FA-AFE4FAB2F5E9}">
-  <ds:schemaRefs>
-    <ds:schemaRef ds:uri="http://schemas.openxmlformats.org/officeDocument/2006/bibliography"/>
-  </ds:schemaRefs>
-</ds:datastoreItem>
 </file>
</xml_diff>

<commit_message>
fix(so): uppercase employee full name in document generation
Update the `so_generate` function to convert the `employee_full_name`
to uppercase when replacing the placeholder in the document template.
This ensures consistent capitalization for the employee name field
in the generated SO document.
</commit_message>
<xml_diff>
--- a/so_templates/S_O_TEMP.docx
+++ b/so_templates/S_O_TEMP.docx
@@ -715,10 +715,10 @@
         <mc:AlternateContent>
           <mc:Choice Requires="wps">
             <w:drawing>
-              <wp:anchor distT="45720" distB="45720" distL="114300" distR="114300" simplePos="0" relativeHeight="251659264" behindDoc="1" locked="1" layoutInCell="1" allowOverlap="1" wp14:anchorId="5793D4C5" wp14:editId="2A2E5F40">
+              <wp:anchor distT="45720" distB="45720" distL="114300" distR="114300" simplePos="0" relativeHeight="251659264" behindDoc="1" locked="1" layoutInCell="1" allowOverlap="1" wp14:anchorId="5793D4C5" wp14:editId="451123B6">
                 <wp:simplePos x="0" y="0"/>
                 <wp:positionH relativeFrom="margin">
-                  <wp:posOffset>810260</wp:posOffset>
+                  <wp:posOffset>848360</wp:posOffset>
                 </wp:positionH>
                 <wp:positionV relativeFrom="paragraph">
                   <wp:posOffset>6985</wp:posOffset>
@@ -818,7 +818,7 @@
                 <v:stroke joinstyle="miter"/>
                 <v:path gradientshapeok="t" o:connecttype="rect"/>
               </v:shapetype>
-              <v:shape id="Text Box 2" o:spid="_x0000_s1026" type="#_x0000_t202" style="position:absolute;left:0;text-align:left;margin-left:63.8pt;margin-top:.55pt;width:85pt;height:85pt;z-index:-251657216;visibility:visible;mso-wrap-style:square;mso-width-percent:0;mso-height-percent:0;mso-wrap-distance-left:9pt;mso-wrap-distance-top:3.6pt;mso-wrap-distance-right:9pt;mso-wrap-distance-bottom:3.6pt;mso-position-horizontal:absolute;mso-position-horizontal-relative:margin;mso-position-vertical:absolute;mso-position-vertical-relative:text;mso-width-percent:0;mso-height-percent:0;mso-width-relative:margin;mso-height-relative:margin;v-text-anchor:top" o:gfxdata="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" filled="f" stroked="f">
+              <v:shape id="Text Box 2" o:spid="_x0000_s1026" type="#_x0000_t202" style="position:absolute;left:0;text-align:left;margin-left:66.8pt;margin-top:.55pt;width:85pt;height:85pt;z-index:-251657216;visibility:visible;mso-wrap-style:square;mso-width-percent:0;mso-height-percent:0;mso-wrap-distance-left:9pt;mso-wrap-distance-top:3.6pt;mso-wrap-distance-right:9pt;mso-wrap-distance-bottom:3.6pt;mso-position-horizontal:absolute;mso-position-horizontal-relative:margin;mso-position-vertical:absolute;mso-position-vertical-relative:text;mso-width-percent:0;mso-height-percent:0;mso-width-relative:margin;mso-height-relative:margin;v-text-anchor:top" o:gfxdata="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" filled="f" stroked="f">
                 <v:textbox>
                   <w:txbxContent>
                     <w:p>

</xml_diff>

<commit_message>
chore(templates): update S_O_TEMP.docx template file
</commit_message>
<xml_diff>
--- a/so_templates/S_O_TEMP.docx
+++ b/so_templates/S_O_TEMP.docx
@@ -715,13 +715,13 @@
         <mc:AlternateContent>
           <mc:Choice Requires="wps">
             <w:drawing>
-              <wp:anchor distT="45720" distB="45720" distL="114300" distR="114300" simplePos="0" relativeHeight="251659264" behindDoc="1" locked="1" layoutInCell="1" allowOverlap="1" wp14:anchorId="5793D4C5" wp14:editId="451123B6">
+              <wp:anchor distT="45720" distB="45720" distL="114300" distR="114300" simplePos="0" relativeHeight="251659264" behindDoc="1" locked="1" layoutInCell="1" allowOverlap="1" wp14:anchorId="5793D4C5" wp14:editId="63831959">
                 <wp:simplePos x="0" y="0"/>
                 <wp:positionH relativeFrom="margin">
-                  <wp:posOffset>848360</wp:posOffset>
+                  <wp:posOffset>724535</wp:posOffset>
                 </wp:positionH>
                 <wp:positionV relativeFrom="paragraph">
-                  <wp:posOffset>6985</wp:posOffset>
+                  <wp:posOffset>-50165</wp:posOffset>
                 </wp:positionV>
                 <wp:extent cx="1079500" cy="1079500"/>
                 <wp:effectExtent l="0" t="0" r="0" b="6350"/>
@@ -818,7 +818,7 @@
                 <v:stroke joinstyle="miter"/>
                 <v:path gradientshapeok="t" o:connecttype="rect"/>
               </v:shapetype>
-              <v:shape id="Text Box 2" o:spid="_x0000_s1026" type="#_x0000_t202" style="position:absolute;left:0;text-align:left;margin-left:66.8pt;margin-top:.55pt;width:85pt;height:85pt;z-index:-251657216;visibility:visible;mso-wrap-style:square;mso-width-percent:0;mso-height-percent:0;mso-wrap-distance-left:9pt;mso-wrap-distance-top:3.6pt;mso-wrap-distance-right:9pt;mso-wrap-distance-bottom:3.6pt;mso-position-horizontal:absolute;mso-position-horizontal-relative:margin;mso-position-vertical:absolute;mso-position-vertical-relative:text;mso-width-percent:0;mso-height-percent:0;mso-width-relative:margin;mso-height-relative:margin;v-text-anchor:top" o:gfxdata="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" filled="f" stroked="f">
+              <v:shape id="Text Box 2" o:spid="_x0000_s1026" type="#_x0000_t202" style="position:absolute;left:0;text-align:left;margin-left:57.05pt;margin-top:-3.95pt;width:85pt;height:85pt;z-index:-251657216;visibility:visible;mso-wrap-style:square;mso-width-percent:0;mso-height-percent:0;mso-wrap-distance-left:9pt;mso-wrap-distance-top:3.6pt;mso-wrap-distance-right:9pt;mso-wrap-distance-bottom:3.6pt;mso-position-horizontal:absolute;mso-position-horizontal-relative:margin;mso-position-vertical:absolute;mso-position-vertical-relative:text;mso-width-percent:0;mso-height-percent:0;mso-width-relative:margin;mso-height-relative:margin;v-text-anchor:top" o:gfxdata="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" filled="f" stroked="f">
                 <v:textbox>
                   <w:txbxContent>
                     <w:p>
@@ -3464,10 +3464,6 @@
 </file>
 
 <file path=customXml/item1.xml><?xml version="1.0" encoding="utf-8"?>
-<b:Sources xmlns:b="http://schemas.openxmlformats.org/officeDocument/2006/bibliography" xmlns="http://schemas.openxmlformats.org/officeDocument/2006/bibliography" SelectedStyle="\APASixthEditionOfficeOnline.xsl" StyleName="APA" Version="6"/>
-</file>
-
-<file path=customXml/item2.xml><?xml version="1.0" encoding="utf-8"?>
 <s:customData xmlns="http://www.wps.cn/officeDocument/2013/wpsCustomData" xmlns:s="http://www.wps.cn/officeDocument/2013/wpsCustomData">
   <customSectProps/>
   <customShpExts>
@@ -3476,18 +3472,22 @@
 </s:customData>
 </file>
 
+<file path=customXml/item2.xml><?xml version="1.0" encoding="utf-8"?>
+<b:Sources xmlns:b="http://schemas.openxmlformats.org/officeDocument/2006/bibliography" xmlns="http://schemas.openxmlformats.org/officeDocument/2006/bibliography" SelectedStyle="\APASixthEditionOfficeOnline.xsl" StyleName="APA" Version="6"/>
+</file>
+
 <file path=customXml/itemProps1.xml><?xml version="1.0" encoding="utf-8"?>
+<ds:datastoreItem xmlns:ds="http://schemas.openxmlformats.org/officeDocument/2006/customXml" ds:itemID="{B1977F7D-205B-4081-913C-38D41E755F92}">
+  <ds:schemaRefs>
+    <ds:schemaRef ds:uri="http://www.wps.cn/officeDocument/2013/wpsCustomData"/>
+  </ds:schemaRefs>
+</ds:datastoreItem>
+</file>
+
+<file path=customXml/itemProps2.xml><?xml version="1.0" encoding="utf-8"?>
 <ds:datastoreItem xmlns:ds="http://schemas.openxmlformats.org/officeDocument/2006/customXml" ds:itemID="{335C0E28-4147-4C6F-B7FA-AFE4FAB2F5E9}">
   <ds:schemaRefs>
     <ds:schemaRef ds:uri="http://schemas.openxmlformats.org/officeDocument/2006/bibliography"/>
   </ds:schemaRefs>
 </ds:datastoreItem>
-</file>
-
-<file path=customXml/itemProps2.xml><?xml version="1.0" encoding="utf-8"?>
-<ds:datastoreItem xmlns:ds="http://schemas.openxmlformats.org/officeDocument/2006/customXml" ds:itemID="{B1977F7D-205B-4081-913C-38D41E755F92}">
-  <ds:schemaRefs>
-    <ds:schemaRef ds:uri="http://www.wps.cn/officeDocument/2013/wpsCustomData"/>
-  </ds:schemaRefs>
-</ds:datastoreItem>
 </file>
</xml_diff>

<commit_message>
docs(templates): adjust whitespace in S_O_TEMP.docx template
</commit_message>
<xml_diff>
--- a/so_templates/S_O_TEMP.docx
+++ b/so_templates/S_O_TEMP.docx
@@ -37,21 +37,7 @@
         <w:rPr>
           <w:rFonts w:ascii="Bookman Old Style" w:hAnsi="Bookman Old Style"/>
         </w:rPr>
-        <w:t xml:space="preserve">             </w:t>
-      </w:r>
-      <w:proofErr w:type="gramStart"/>
-      <w:r>
-        <w:rPr>
-          <w:rFonts w:ascii="Bookman Old Style" w:hAnsi="Bookman Old Style"/>
-        </w:rPr>
-        <w:t xml:space="preserve">  ,</w:t>
-      </w:r>
-      <w:proofErr w:type="gramEnd"/>
-      <w:r>
-        <w:rPr>
-          <w:rFonts w:ascii="Bookman Old Style" w:hAnsi="Bookman Old Style"/>
-        </w:rPr>
-        <w:t xml:space="preserve"> s. 202</w:t>
+        <w:t xml:space="preserve">               , s. 202</w:t>
       </w:r>
       <w:r>
         <w:rPr>
@@ -981,20 +967,6 @@
         </w:rPr>
         <w:t>CONCERED</w:t>
       </w:r>
-    </w:p>
-    <w:p>
-      <w:pPr>
-        <w:pStyle w:val="NoSpacing"/>
-        <w:tabs>
-          <w:tab w:val="left" w:pos="0"/>
-        </w:tabs>
-        <w:jc w:val="both"/>
-        <w:rPr>
-          <w:rFonts w:ascii="Bookman Old Style" w:hAnsi="Bookman Old Style"/>
-          <w:sz w:val="10"/>
-          <w:szCs w:val="10"/>
-        </w:rPr>
-      </w:pPr>
     </w:p>
     <w:p>
       <w:pPr>
@@ -3464,6 +3436,10 @@
 </file>
 
 <file path=customXml/item1.xml><?xml version="1.0" encoding="utf-8"?>
+<b:Sources xmlns:b="http://schemas.openxmlformats.org/officeDocument/2006/bibliography" xmlns="http://schemas.openxmlformats.org/officeDocument/2006/bibliography" SelectedStyle="\APASixthEditionOfficeOnline.xsl" StyleName="APA" Version="6"/>
+</file>
+
+<file path=customXml/item2.xml><?xml version="1.0" encoding="utf-8"?>
 <s:customData xmlns="http://www.wps.cn/officeDocument/2013/wpsCustomData" xmlns:s="http://www.wps.cn/officeDocument/2013/wpsCustomData">
   <customSectProps/>
   <customShpExts>
@@ -3472,22 +3448,18 @@
 </s:customData>
 </file>
 
-<file path=customXml/item2.xml><?xml version="1.0" encoding="utf-8"?>
-<b:Sources xmlns:b="http://schemas.openxmlformats.org/officeDocument/2006/bibliography" xmlns="http://schemas.openxmlformats.org/officeDocument/2006/bibliography" SelectedStyle="\APASixthEditionOfficeOnline.xsl" StyleName="APA" Version="6"/>
+<file path=customXml/itemProps1.xml><?xml version="1.0" encoding="utf-8"?>
+<ds:datastoreItem xmlns:ds="http://schemas.openxmlformats.org/officeDocument/2006/customXml" ds:itemID="{335C0E28-4147-4C6F-B7FA-AFE4FAB2F5E9}">
+  <ds:schemaRefs>
+    <ds:schemaRef ds:uri="http://schemas.openxmlformats.org/officeDocument/2006/bibliography"/>
+  </ds:schemaRefs>
+</ds:datastoreItem>
 </file>
 
-<file path=customXml/itemProps1.xml><?xml version="1.0" encoding="utf-8"?>
+<file path=customXml/itemProps2.xml><?xml version="1.0" encoding="utf-8"?>
 <ds:datastoreItem xmlns:ds="http://schemas.openxmlformats.org/officeDocument/2006/customXml" ds:itemID="{B1977F7D-205B-4081-913C-38D41E755F92}">
   <ds:schemaRefs>
     <ds:schemaRef ds:uri="http://www.wps.cn/officeDocument/2013/wpsCustomData"/>
   </ds:schemaRefs>
 </ds:datastoreItem>
-</file>
-
-<file path=customXml/itemProps2.xml><?xml version="1.0" encoding="utf-8"?>
-<ds:datastoreItem xmlns:ds="http://schemas.openxmlformats.org/officeDocument/2006/customXml" ds:itemID="{335C0E28-4147-4C6F-B7FA-AFE4FAB2F5E9}">
-  <ds:schemaRefs>
-    <ds:schemaRef ds:uri="http://schemas.openxmlformats.org/officeDocument/2006/bibliography"/>
-  </ds:schemaRefs>
-</ds:datastoreItem>
 </file>
</xml_diff>